<commit_message>
Rewrite "Plan de formation continue" as continuous academic prose
Remove bullet lists and semicolons, add smooth transitions between
sentences and paragraphs per requested academic style.

Co-Authored-By: Claude Opus 4.8 <noreply@anthropic.com>
Claude-Session: https://claude.ai/code/session_014y2uekwXSXYRSbjU1e8mB9
</commit_message>
<xml_diff>
--- a/Plan_de_formation_continue.docx
+++ b/Plan_de_formation_continue.docx
@@ -9,7 +9,6 @@
       </w:pPr>
       <w:r>
         <w:rPr>
-          <w:rFonts w:ascii="Calibri" w:hAnsi="Calibri"/>
           <w:b/>
           <w:color w:val="1F3A5F"/>
           <w:sz w:val="36"/>
@@ -19,14 +18,14 @@
     </w:p>
     <w:p>
       <w:pPr>
-        <w:spacing w:after="280"/>
+        <w:spacing w:after="320"/>
         <w:jc w:val="center"/>
       </w:pPr>
       <w:r>
         <w:rPr>
           <w:i/>
           <w:color w:val="555555"/>
-          <w:sz w:val="22"/>
+          <w:sz w:val="24"/>
         </w:rPr>
         <w:t>Travail individuel — DESS en gestion de l’éducation</w:t>
       </w:r>
@@ -37,7 +36,6 @@
       </w:pPr>
       <w:r>
         <w:rPr>
-          <w:rFonts w:ascii="Calibri" w:hAnsi="Calibri"/>
           <w:b/>
           <w:color w:val="1F3A5F"/>
           <w:sz w:val="28"/>
@@ -50,7 +48,7 @@
         <w:jc w:val="both"/>
       </w:pPr>
       <w:r>
-        <w:t>Reconnaître ses forces, mais surtout nommer honnêtement ses faiblesses, demeure l’un des exercices les plus exigeants — et les plus utiles — du métier de gestionnaire en éducation. Au Québec, la formation continue n’est pas un luxe : elle est consignée au dossier de chaque employé et témoigne de notre volonté de demeurer compétents dans un milieu en constante évolution. C’est dans cet esprit que j’ai pris le temps, tout au long de la session, d’observer ma pratique et de réfléchir à l’écart qui me sépare encore du gestionnaire que je souhaite devenir.</w:t>
+        <w:t>Reconnaître ses forces relève souvent de l’aisance, mais nommer honnêtement ses faiblesses demeure l’un des exercices les plus exigeants du métier de gestionnaire en éducation. Au Québec, la formation continue ne constitue pas un simple ornement professionnel, car elle est consignée au dossier de chaque employé et témoigne de notre volonté de demeurer compétents dans un milieu en constante transformation. C’est précisément dans cet esprit que j’ai pris le temps, tout au long de la session, d’observer ma pratique avec lucidité et de mesurer l’écart qui me sépare encore du gestionnaire que je souhaite devenir. Loin d’être un bilan complaisant, cette démarche se veut une analyse franche de mon cheminement.</w:t>
       </w:r>
     </w:p>
     <w:p>
@@ -58,7 +56,7 @@
         <w:jc w:val="both"/>
       </w:pPr>
       <w:r>
-        <w:t>Ma situation est particulière et, je crois, mobilisatrice. Je travaille actuellement au sein d’un centre de soutien à l’enseignement à la maison, où j’accompagne des familles et des élèves dans leur parcours d’apprentissage. Mon projet professionnel, toutefois, va plus loin : je souhaite fonder mon propre établissement d’enseignement privé et en assumer la direction. Ce passage du rôle d’accompagnateur à celui de fondateur-directeur transforme profondément la nature des compétences que je dois maîtriser. Le présent plan de formation continue est donc à la fois un bilan lucide de mes acquis et une feuille de route vers ce projet.</w:t>
+        <w:t>Ma situation présente par ailleurs une particularité qui rend l’exercice d’autant plus mobilisateur. Je travaille actuellement au sein d’un centre de soutien à l’enseignement à la maison, où j’accompagne quotidiennement des familles et des élèves dans leur parcours d’apprentissage. Mon projet professionnel dépasse toutefois ce cadre, puisque je souhaite fonder mon propre établissement d’enseignement privé et en assumer la direction. Or, ce passage du rôle d’accompagnateur à celui de fondateur et de directeur transforme en profondeur la nature des compétences que je dois maîtriser. Le présent plan de formation continue se présente donc à la fois comme un bilan honnête de mes acquis et comme une feuille de route vers ce projet qui m’anime.</w:t>
       </w:r>
     </w:p>
     <w:p>
@@ -67,12 +65,11 @@
       </w:pPr>
       <w:r>
         <w:rPr>
-          <w:rFonts w:ascii="Calibri" w:hAnsi="Calibri"/>
           <w:b/>
           <w:color w:val="1F3A5F"/>
           <w:sz w:val="28"/>
         </w:rPr>
-        <w:t>1. Mon contexte professionnel et mon projet</w:t>
+        <w:t>Mon contexte professionnel et mon projet</w:t>
       </w:r>
     </w:p>
     <w:p>
@@ -80,7 +77,7 @@
         <w:jc w:val="both"/>
       </w:pPr>
       <w:r>
-        <w:t>L’enseignement à la maison connaît une croissance marquée au Québec, encadré par la Direction de l’enseignement à la maison du ministère de l’Éducation et par le projet d’apprentissage que chaque famille doit déposer. Mon travail au centre de soutien m’a permis de comprendre les besoins réels des familles : structure, ressources pédagogiques de qualité, suivi rigoureux et un environnement d’apprentissage stimulant.</w:t>
+        <w:t>L’enseignement à la maison connaît au Québec une croissance marquée, encadré par la Direction de l’enseignement à la maison du ministère de l’Éducation ainsi que par le projet d’apprentissage que chaque famille doit déposer. Mon travail au centre de soutien m’a permis de saisir les besoins réels de ces familles, qu’il s’agisse de structure, de ressources pédagogiques de qualité, de suivi rigoureux ou d’un environnement d’apprentissage véritablement stimulant. Cette proximité avec les familles constitue le terreau de ma réflexion, car elle m’a révélé tout ce qu’un établissement bien pensé pourrait leur offrir.</w:t>
       </w:r>
     </w:p>
     <w:p>
@@ -88,7 +85,7 @@
         <w:jc w:val="both"/>
       </w:pPr>
       <w:r>
-        <w:t>Fonder une école privée constitue le prolongement naturel de cette expérience. Or, diriger un établissement d’enseignement privé au Québec exige bien plus qu’une bonne pédagogie : cela suppose d’obtenir un permis du Ministère en vertu de la Loi sur l’enseignement privé, de respecter le régime pédagogique et le Programme de formation de l’école québécoise, de gérer un budget de fonctionnement, du personnel et une gouvernance conforme. C’est précisément en confrontant ce projet à mes compétences actuelles que mes forces et mes lacunes se sont révélées avec le plus de clarté.</w:t>
+        <w:t>Fonder une école privée apparaît dès lors comme le prolongement naturel de cette expérience. Diriger un tel établissement au Québec exige néanmoins bien davantage qu’une solide pédagogie. Cela suppose en effet d’obtenir un permis du Ministère en vertu de la Loi sur l’enseignement privé, de respecter le régime pédagogique et le Programme de formation de l’école québécoise, puis de gérer un budget de fonctionnement, du personnel et une gouvernance conforme aux exigences en vigueur. C’est en confrontant ce projet ambitieux à mes compétences actuelles que mes forces et mes lacunes se sont révélées avec le plus de clarté.</w:t>
       </w:r>
     </w:p>
     <w:p>
@@ -97,12 +94,11 @@
       </w:pPr>
       <w:r>
         <w:rPr>
-          <w:rFonts w:ascii="Calibri" w:hAnsi="Calibri"/>
           <w:b/>
           <w:color w:val="1F3A5F"/>
           <w:sz w:val="28"/>
         </w:rPr>
-        <w:t>2. Mes forces</w:t>
+        <w:t>Mes forces</w:t>
       </w:r>
     </w:p>
     <w:p>
@@ -110,13 +106,7 @@
         <w:jc w:val="both"/>
       </w:pPr>
       <w:r>
-        <w:rPr>
-          <w:b/>
-        </w:rPr>
-        <w:t xml:space="preserve">La communication et les relations interpersonnelles. </w:t>
-      </w:r>
-      <w:r>
-        <w:t>Mon rôle actuel repose entièrement sur la qualité du lien que je tisse avec les familles. Je sais écouter, reformuler un besoin, désamorcer une inquiétude et bâtir un climat de confiance. Cette force sera déterminante pour mobiliser une équipe enseignante, rassurer des parents et incarner le leadership rassembleur qu’attend une direction d’école.</w:t>
+        <w:t>Ma première force réside dans la communication et les relations interpersonnelles, car mon rôle actuel repose entièrement sur la qualité du lien que je tisse avec les familles. Je sais écouter avec attention, reformuler un besoin, désamorcer une inquiétude et bâtir patiemment un climat de confiance. Cette aptitude se révélera déterminante le jour où je devrai mobiliser une équipe enseignante, rassurer des parents et incarner le leadership rassembleur qu’attend toute direction d’école.</w:t>
       </w:r>
     </w:p>
     <w:p>
@@ -124,13 +114,7 @@
         <w:jc w:val="both"/>
       </w:pPr>
       <w:r>
-        <w:rPr>
-          <w:b/>
-        </w:rPr>
-        <w:t xml:space="preserve">L’organisation et la rigueur. </w:t>
-      </w:r>
-      <w:r>
-        <w:t>La planification, le suivi méthodique des dossiers et le souci du travail bien fait font partie de ma manière d’être. Dans un projet aussi complexe que la création d’un établissement — où les échéances ministérielles, pédagogiques et administratives s’entrecroisent —, cette rigueur est un atout précieux pour ne rien échapper.</w:t>
+        <w:t>À cette force s’ajoute une organisation rigoureuse, puisque la planification, le suivi méthodique des dossiers et le souci du travail bien fait façonnent ma manière d’agir au quotidien. Dans un projet aussi complexe que la création d’un établissement, où les échéances ministérielles, pédagogiques et administratives s’entrecroisent constamment, cette rigueur devient un atout précieux pour ne rien laisser au hasard. Elle me permet d’aborder l’ampleur de la tâche avec méthode plutôt qu’avec appréhension.</w:t>
       </w:r>
     </w:p>
     <w:p>
@@ -138,21 +122,7 @@
         <w:jc w:val="both"/>
       </w:pPr>
       <w:r>
-        <w:rPr>
-          <w:b/>
-        </w:rPr>
-        <w:t xml:space="preserve">L’innovation et l’aisance technologique. </w:t>
-      </w:r>
-      <w:r>
-        <w:t>J’adopte volontiers les outils numériques et je m’intéresse de près aux usages pédagogiques de l’intelligence artificielle. Cette ouverture me permet d’imaginer une école agile, dotée d’outils de gestion modernes et d’approches pédagogiques actuelles, plutôt que de reproduire des modèles dépassés.</w:t>
-      </w:r>
-    </w:p>
-    <w:p>
-      <w:pPr>
-        <w:jc w:val="both"/>
-      </w:pPr>
-      <w:r>
-        <w:t>Ces trois forces forment un socle solide. Elles ne suffisent toutefois pas, à elles seules, à porter un projet de direction d’établissement.</w:t>
+        <w:t>Enfin, mon ouverture à l’innovation et mon aisance technologique complètent ce portrait. J’adopte volontiers les outils numériques et je m’intéresse de près aux usages pédagogiques de l’intelligence artificielle. Grâce à cette curiosité, je peux imaginer une école agile, dotée d’outils de gestion modernes et d’approches pédagogiques actuelles, plutôt que de reproduire des modèles dépassés. Ces trois forces forment ainsi un socle solide, même si elles ne suffisent pas, à elles seules, à porter un projet de direction d’établissement.</w:t>
       </w:r>
     </w:p>
     <w:p>
@@ -161,12 +131,11 @@
       </w:pPr>
       <w:r>
         <w:rPr>
-          <w:rFonts w:ascii="Calibri" w:hAnsi="Calibri"/>
           <w:b/>
           <w:color w:val="1F3A5F"/>
           <w:sz w:val="28"/>
         </w:rPr>
-        <w:t>3. Mes faiblesses et les défis à relever</w:t>
+        <w:t>Mes faiblesses et les défis à relever</w:t>
       </w:r>
     </w:p>
     <w:p>
@@ -174,7 +143,7 @@
         <w:jc w:val="both"/>
       </w:pPr>
       <w:r>
-        <w:t>L’honnêteté de cet exercice m’impose de reconnaître trois zones où mes compétences sont nettement insuffisantes au regard de mon projet.</w:t>
+        <w:t>L’honnêteté de cet exercice m’impose de reconnaître trois zones où mes compétences demeurent nettement insuffisantes au regard de mon projet. La première, et sans doute la plus criante, concerne la gestion budgétaire et des ressources. Je n’ai en effet jamais eu à élaborer un budget de fonctionnement, à projeter des revenus et des dépenses, à gérer une masse salariale ou à assurer la viabilité financière d’une organisation. Pourtant, une école privée demeure aussi une entreprise, et sans équilibre budgétaire, le projet pédagogique le plus inspirant finit inévitablement par s’effondrer.</w:t>
       </w:r>
     </w:p>
     <w:p>
@@ -182,13 +151,7 @@
         <w:jc w:val="both"/>
       </w:pPr>
       <w:r>
-        <w:rPr>
-          <w:b/>
-        </w:rPr>
-        <w:t xml:space="preserve">La gestion budgétaire et des ressources. </w:t>
-      </w:r>
-      <w:r>
-        <w:t>Je n’ai jamais eu à élaborer un budget de fonctionnement, à projeter des revenus et des dépenses, à gérer la masse salariale ni à assurer la viabilité financière d’une organisation. Or, une école privée est aussi une entreprise : sans équilibre budgétaire, le projet pédagogique le plus inspirant s’effondre. C’est ma lacune la plus criante.</w:t>
+        <w:t>Ma deuxième faiblesse touche le cadre juridique et la gouvernance, car le secteur de l’éducation se trouve fortement réglementé. La Loi sur l’enseignement privé, les obligations envers le Ministère, le droit du travail, la protection des renseignements personnels encadrée par la Loi 25 et les règles de gouvernance d’un organisme me sont encore peu familiers. Diriger un établissement sans maîtriser ce cadre reviendrait à l’exposer à des risques sérieux, ce que je ne saurais me permettre.</w:t>
       </w:r>
     </w:p>
     <w:p>
@@ -196,27 +159,7 @@
         <w:jc w:val="both"/>
       </w:pPr>
       <w:r>
-        <w:rPr>
-          <w:b/>
-        </w:rPr>
-        <w:t xml:space="preserve">Le cadre juridique et la gouvernance. </w:t>
-      </w:r>
-      <w:r>
-        <w:t>Le secteur de l’éducation est fortement réglementé. La Loi sur l’enseignement privé, les obligations envers le Ministère, le droit du travail, la protection des renseignements personnels (Loi 25) et les règles de gouvernance d’un organisme me sont encore peu familiers. Diriger sans maîtriser ce cadre, c’est exposer l’établissement à des risques sérieux.</w:t>
-      </w:r>
-    </w:p>
-    <w:p>
-      <w:pPr>
-        <w:jc w:val="both"/>
-      </w:pPr>
-      <w:r>
-        <w:rPr>
-          <w:b/>
-        </w:rPr>
-        <w:t xml:space="preserve">Le leadership pédagogique. </w:t>
-      </w:r>
-      <w:r>
-        <w:t>Accompagner des familles individuellement n’est pas la même chose que de diriger une équipe d’enseignants, de superviser l’enseignement, d’analyser des résultats et de soutenir les élèves à besoins particuliers (EHDAA). Je dois développer une vision pédagogique d’établissement et les compétences pour la déployer auprès d’un personnel.</w:t>
+        <w:t>Ma troisième lacune relève du leadership pédagogique, dont les exigences diffèrent profondément de mon expérience actuelle. Accompagner des familles de manière individuelle n’a en effet rien de comparable au fait de diriger une équipe d’enseignants, de superviser l’enseignement, d’analyser des résultats ou de soutenir les élèves à besoins particuliers. Pour cette raison, je dois développer une véritable vision pédagogique d’établissement ainsi que les compétences nécessaires pour la déployer auprès d’un personnel.</w:t>
       </w:r>
     </w:p>
     <w:p>
@@ -225,12 +168,11 @@
       </w:pPr>
       <w:r>
         <w:rPr>
-          <w:rFonts w:ascii="Calibri" w:hAnsi="Calibri"/>
           <w:b/>
           <w:color w:val="1F3A5F"/>
           <w:sz w:val="28"/>
         </w:rPr>
-        <w:t>4. Mon plan de formation continue</w:t>
+        <w:t>Mon plan de formation continue</w:t>
       </w:r>
     </w:p>
     <w:p>
@@ -238,265 +180,23 @@
         <w:jc w:val="both"/>
       </w:pPr>
       <w:r>
-        <w:t>Pour chacune de ces lacunes, j’ai ciblé des formations concrètes, accessibles au Québec, ainsi que des moyens complémentaires.</w:t>
+        <w:t>Pour combler ma lacune en gestion budgétaire, je compte d’abord suivre une formation consacrée à la gestion financière destinée aux gestionnaires non financiers, comme celle qu’offre l’École des dirigeants de HEC Montréal, afin de maîtriser le langage comptable, le budget prévisionnel et l’analyse des états financiers. J’envisage ensuite un microprogramme de deuxième cycle en gestion, accessible notamment à la TÉLUQ ou à l’Université de Sherbrooke, pour consolider les bases de l’administration d’une organisation. Les formations de la Fédération des établissements d’enseignement privés viendront compléter ce parcours, puisqu’elles abordent directement le financement et l’administration d’un établissement. Au-delà de ces formations, je prévois me familiariser avec un logiciel de comptabilité et construire, à titre d’exercice, un budget prévisionnel sur trois ans pour mon futur établissement.</w:t>
       </w:r>
     </w:p>
     <w:p>
       <w:pPr>
-        <w:spacing w:before="200" w:after="80"/>
+        <w:jc w:val="both"/>
       </w:pPr>
       <w:r>
-        <w:rPr>
-          <w:rFonts w:ascii="Calibri" w:hAnsi="Calibri"/>
-          <w:b/>
-          <w:color w:val="1F3A5F"/>
-          <w:sz w:val="24"/>
-        </w:rPr>
-        <w:t>4.1 Renforcer la gestion budgétaire et des ressources</w:t>
+        <w:t>Sur le plan juridique, je souhaite suivre une formation en droit scolaire et en droit de l’éducation qui couvre la Loi sur l’enseignement privé et la Loi sur l’instruction publique. Une formation portant spécifiquement sur la Loi 25 s’impose également, car la protection des renseignements personnels devient incontournable dès lors qu’une école gère les données d’élèves mineurs. J’aimerais par ailleurs suivre une formation en gouvernance, offerte par exemple par le Collège des administrateurs de sociétés, afin de bien comprendre le rôle d’un conseil d’administration et l’étendue de mes responsabilités de dirigeant. Pour ancrer ces apprentissages dans la réalité, je compte rencontrer une direction d’école privée déjà en exercice et consulter attentivement la documentation ministérielle relative à la délivrance des permis.</w:t>
       </w:r>
     </w:p>
     <w:p>
       <w:pPr>
-        <w:pStyle w:val="ListBullet"/>
         <w:jc w:val="both"/>
       </w:pPr>
       <w:r>
-        <w:rPr>
-          <w:b/>
-        </w:rPr>
-        <w:t xml:space="preserve">Formation « Gestion financière pour gestionnaires non financiers » </w:t>
-      </w:r>
-      <w:r>
-        <w:rPr>
-          <w:b w:val="0"/>
-        </w:rPr>
-        <w:t>offerte par l’École des dirigeants de HEC Montréal, afin de maîtriser le langage comptable, le budget prévisionnel et l’analyse des états financiers.</w:t>
-      </w:r>
-    </w:p>
-    <w:p>
-      <w:pPr>
-        <w:pStyle w:val="ListBullet"/>
-        <w:jc w:val="both"/>
-      </w:pPr>
-      <w:r>
-        <w:rPr>
-          <w:b/>
-        </w:rPr>
-        <w:t xml:space="preserve">Attestation ou microprogramme de 2e cycle en gestion </w:t>
-      </w:r>
-      <w:r>
-        <w:rPr>
-          <w:b w:val="0"/>
-        </w:rPr>
-        <w:t>(TÉLUQ ou Université de Sherbrooke), pour consolider les bases de la gestion d’une organisation.</w:t>
-      </w:r>
-    </w:p>
-    <w:p>
-      <w:pPr>
-        <w:pStyle w:val="ListBullet"/>
-        <w:jc w:val="both"/>
-      </w:pPr>
-      <w:r>
-        <w:rPr>
-          <w:b/>
-        </w:rPr>
-        <w:t xml:space="preserve">Formations de la Fédération des établissements d’enseignement privés (FEEP) </w:t>
-      </w:r>
-      <w:r>
-        <w:rPr>
-          <w:b w:val="0"/>
-        </w:rPr>
-        <w:t>portant sur l’administration et le financement d’un établissement.</w:t>
-      </w:r>
-    </w:p>
-    <w:p>
-      <w:pPr>
-        <w:pStyle w:val="ListBullet"/>
-        <w:jc w:val="both"/>
-      </w:pPr>
-      <w:r>
-        <w:rPr>
-          <w:b/>
-        </w:rPr>
-        <w:t xml:space="preserve">Moyen complémentaire : </w:t>
-      </w:r>
-      <w:r>
-        <w:rPr>
-          <w:b w:val="0"/>
-        </w:rPr>
-        <w:t>me familiariser avec un logiciel de comptabilité (Sage ou QuickBooks) et construire, en exercice, un budget prévisionnel sur trois ans pour mon futur établissement.</w:t>
-      </w:r>
-    </w:p>
-    <w:p>
-      <w:pPr>
-        <w:spacing w:before="200" w:after="80"/>
-      </w:pPr>
-      <w:r>
-        <w:rPr>
-          <w:rFonts w:ascii="Calibri" w:hAnsi="Calibri"/>
-          <w:b/>
-          <w:color w:val="1F3A5F"/>
-          <w:sz w:val="24"/>
-        </w:rPr>
-        <w:t>4.2 Maîtriser le cadre juridique et la gouvernance</w:t>
-      </w:r>
-    </w:p>
-    <w:p>
-      <w:pPr>
-        <w:pStyle w:val="ListBullet"/>
-        <w:jc w:val="both"/>
-      </w:pPr>
-      <w:r>
-        <w:rPr>
-          <w:b/>
-        </w:rPr>
-        <w:t xml:space="preserve">Cours ou formation en droit scolaire et en droit de l’éducation </w:t>
-      </w:r>
-      <w:r>
-        <w:rPr>
-          <w:b w:val="0"/>
-        </w:rPr>
-        <w:t>(notamment les formations universitaires ou continues abordant la Loi sur l’enseignement privé et la Loi sur l’instruction publique).</w:t>
-      </w:r>
-    </w:p>
-    <w:p>
-      <w:pPr>
-        <w:pStyle w:val="ListBullet"/>
-        <w:jc w:val="both"/>
-      </w:pPr>
-      <w:r>
-        <w:rPr>
-          <w:b/>
-        </w:rPr>
-        <w:t xml:space="preserve">Formation sur la Loi 25 </w:t>
-      </w:r>
-      <w:r>
-        <w:rPr>
-          <w:b w:val="0"/>
-        </w:rPr>
-        <w:t>(protection des renseignements personnels), enjeu incontournable pour une école qui gère des données d’élèves mineurs.</w:t>
-      </w:r>
-    </w:p>
-    <w:p>
-      <w:pPr>
-        <w:pStyle w:val="ListBullet"/>
-        <w:jc w:val="both"/>
-      </w:pPr>
-      <w:r>
-        <w:rPr>
-          <w:b/>
-        </w:rPr>
-        <w:t xml:space="preserve">Formation en gouvernance </w:t>
-      </w:r>
-      <w:r>
-        <w:rPr>
-          <w:b w:val="0"/>
-        </w:rPr>
-        <w:t>offerte par le Collège des administrateurs de sociétés ou un organisme équivalent, afin de comprendre le rôle d’un conseil d’administration et mes responsabilités de dirigeant.</w:t>
-      </w:r>
-    </w:p>
-    <w:p>
-      <w:pPr>
-        <w:pStyle w:val="ListBullet"/>
-        <w:jc w:val="both"/>
-      </w:pPr>
-      <w:r>
-        <w:rPr>
-          <w:b/>
-        </w:rPr>
-        <w:t xml:space="preserve">Moyen complémentaire : </w:t>
-      </w:r>
-      <w:r>
-        <w:rPr>
-          <w:b w:val="0"/>
-        </w:rPr>
-        <w:t>rencontrer une direction d’école privée déjà en exercice et consulter la documentation du Ministère sur la délivrance des permis.</w:t>
-      </w:r>
-    </w:p>
-    <w:p>
-      <w:pPr>
-        <w:spacing w:before="200" w:after="80"/>
-      </w:pPr>
-      <w:r>
-        <w:rPr>
-          <w:rFonts w:ascii="Calibri" w:hAnsi="Calibri"/>
-          <w:b/>
-          <w:color w:val="1F3A5F"/>
-          <w:sz w:val="24"/>
-        </w:rPr>
-        <w:t>4.3 Développer mon leadership pédagogique</w:t>
-      </w:r>
-    </w:p>
-    <w:p>
-      <w:pPr>
-        <w:pStyle w:val="ListBullet"/>
-        <w:jc w:val="both"/>
-      </w:pPr>
-      <w:r>
-        <w:rPr>
-          <w:b/>
-        </w:rPr>
-        <w:t xml:space="preserve">Poursuite de mon DESS </w:t>
-      </w:r>
-      <w:r>
-        <w:rPr>
-          <w:b w:val="0"/>
-        </w:rPr>
-        <w:t>et, à terme, formations de 2e cycle en supervision pédagogique et en gestion de l’éducation.</w:t>
-      </w:r>
-    </w:p>
-    <w:p>
-      <w:pPr>
-        <w:pStyle w:val="ListBullet"/>
-        <w:jc w:val="both"/>
-      </w:pPr>
-      <w:r>
-        <w:rPr>
-          <w:b/>
-        </w:rPr>
-        <w:t xml:space="preserve">Formations du CTREQ et colloques pédagogiques </w:t>
-      </w:r>
-      <w:r>
-        <w:rPr>
-          <w:b w:val="0"/>
-        </w:rPr>
-        <w:t>(par exemple ceux de l’AQEP), pour rester à jour sur les pratiques probantes et l’évaluation.</w:t>
-      </w:r>
-    </w:p>
-    <w:p>
-      <w:pPr>
-        <w:pStyle w:val="ListBullet"/>
-        <w:jc w:val="both"/>
-      </w:pPr>
-      <w:r>
-        <w:rPr>
-          <w:b/>
-        </w:rPr>
-        <w:t xml:space="preserve">Formation sur l’intervention auprès des élèves HDAA, </w:t>
-      </w:r>
-      <w:r>
-        <w:rPr>
-          <w:b w:val="0"/>
-        </w:rPr>
-        <w:t>afin de bâtir une école réellement inclusive.</w:t>
-      </w:r>
-    </w:p>
-    <w:p>
-      <w:pPr>
-        <w:pStyle w:val="ListBullet"/>
-        <w:jc w:val="both"/>
-      </w:pPr>
-      <w:r>
-        <w:rPr>
-          <w:b/>
-        </w:rPr>
-        <w:t xml:space="preserve">Moyen complémentaire : </w:t>
-      </w:r>
-      <w:r>
-        <w:rPr>
-          <w:b w:val="0"/>
-        </w:rPr>
-        <w:t>mettre sur pied, dès le démarrage, une communauté d’apprentissage professionnelle (CAP) avec ma future équipe, et m’appuyer sur ma force technologique pour intégrer judicieusement les outils d’IA au service de la pédagogie.</w:t>
+        <w:t>Pour développer mon leadership pédagogique, la poursuite de mon DESS constitue déjà une assise précieuse, que je souhaite approfondir par des formations de deuxième cycle en supervision pédagogique. Les formations du Centre de transfert pour la réussite éducative du Québec ainsi que divers colloques pédagogiques me permettront de demeurer au fait des pratiques probantes et des approches d’évaluation. Une formation sur l’intervention auprès des élèves à besoins particuliers s’avère tout aussi essentielle, puisque je tiens à bâtir une école réellement inclusive. Enfin, je compte mettre sur pied dès le démarrage une communauté d’apprentissage professionnelle avec ma future équipe, tout en m’appuyant sur ma force technologique pour intégrer judicieusement les outils d’intelligence artificielle au service de la pédagogie.</w:t>
       </w:r>
     </w:p>
     <w:p>
@@ -505,12 +205,11 @@
       </w:pPr>
       <w:r>
         <w:rPr>
-          <w:rFonts w:ascii="Calibri" w:hAnsi="Calibri"/>
           <w:b/>
           <w:color w:val="1F3A5F"/>
           <w:sz w:val="28"/>
         </w:rPr>
-        <w:t>5. Ma vision de l’avenir et mon échéancier</w:t>
+        <w:t>Ma vision de l’avenir et mon échéancier</w:t>
       </w:r>
     </w:p>
     <w:p>
@@ -518,7 +217,7 @@
         <w:jc w:val="both"/>
       </w:pPr>
       <w:r>
-        <w:t>Ma vision est claire : ouvrir, dans un horizon de trois ans, un établissement d’enseignement privé à dimension humaine, ancré dans l’expérience que j’ai développée auprès des familles en enseignement à la maison, et porté par une gestion rigoureuse et une pédagogie innovante.</w:t>
+        <w:t>Ma vision se dessine avec clarté, puisque je souhaite ouvrir, dans un horizon de trois ans, un établissement d’enseignement privé à dimension humaine. Cette école s’ancrera dans l’expérience que j’ai développée auprès des familles en enseignement à la maison, tout en étant portée par une gestion rigoureuse et une pédagogie innovante. Pour transformer cette ambition en réalité, je me suis fixé un échéancier progressif qui répartit mes apprentissages sur trois années.</w:t>
       </w:r>
     </w:p>
     <w:p>
@@ -526,61 +225,7 @@
         <w:jc w:val="both"/>
       </w:pPr>
       <w:r>
-        <w:t>Pour y parvenir, je me donne l’échéancier suivant :</w:t>
-      </w:r>
-    </w:p>
-    <w:p>
-      <w:pPr>
-        <w:pStyle w:val="ListBullet"/>
-        <w:jc w:val="both"/>
-      </w:pPr>
-      <w:r>
-        <w:rPr>
-          <w:b/>
-        </w:rPr>
-        <w:t xml:space="preserve">An 1 — Consolider les fondations. </w:t>
-      </w:r>
-      <w:r>
-        <w:rPr>
-          <w:b w:val="0"/>
-        </w:rPr>
-        <w:t>Terminer le DESS, suivre la formation en gestion financière et amorcer la formation en droit scolaire. Rédiger un premier plan d’affaires et un budget prévisionnel.</w:t>
-      </w:r>
-    </w:p>
-    <w:p>
-      <w:pPr>
-        <w:pStyle w:val="ListBullet"/>
-        <w:jc w:val="both"/>
-      </w:pPr>
-      <w:r>
-        <w:rPr>
-          <w:b/>
-        </w:rPr>
-        <w:t xml:space="preserve">An 2 — Préparer le projet. </w:t>
-      </w:r>
-      <w:r>
-        <w:rPr>
-          <w:b w:val="0"/>
-        </w:rPr>
-        <w:t>Compléter les formations en gouvernance et sur la Loi 25, déposer la demande de permis auprès du Ministère et construire le projet éducatif de l’école.</w:t>
-      </w:r>
-    </w:p>
-    <w:p>
-      <w:pPr>
-        <w:pStyle w:val="ListBullet"/>
-        <w:jc w:val="both"/>
-      </w:pPr>
-      <w:r>
-        <w:rPr>
-          <w:b/>
-        </w:rPr>
-        <w:t xml:space="preserve">An 3 — Lancer et diriger. </w:t>
-      </w:r>
-      <w:r>
-        <w:rPr>
-          <w:b w:val="0"/>
-        </w:rPr>
-        <w:t>Recruter et accompagner une première équipe enseignante, déployer ma vision pédagogique et assumer pleinement mon rôle de fondateur-directeur, tout en poursuivant ma formation continue.</w:t>
+        <w:t>La première année sera consacrée à consolider les fondations. Je prévois alors terminer mon DESS, suivre la formation en gestion financière et amorcer mes apprentissages en droit scolaire, tout en rédigeant un premier plan d’affaires accompagné d’un budget prévisionnel. La deuxième année me permettra de préparer concrètement le projet, notamment en complétant mes formations en gouvernance et sur la Loi 25, en déposant ma demande de permis auprès du Ministère et en construisant le projet éducatif de l’école. La troisième année marquera enfin le lancement, alors que je recruterai et accompagnerai une première équipe enseignante, que je déploierai ma vision pédagogique et que j’assumerai pleinement mon rôle de fondateur et de directeur, sans jamais cesser de me former.</w:t>
       </w:r>
     </w:p>
     <w:p>
@@ -589,7 +234,6 @@
       </w:pPr>
       <w:r>
         <w:rPr>
-          <w:rFonts w:ascii="Calibri" w:hAnsi="Calibri"/>
           <w:b/>
           <w:color w:val="1F3A5F"/>
           <w:sz w:val="28"/>
@@ -602,7 +246,7 @@
         <w:jc w:val="both"/>
       </w:pPr>
       <w:r>
-        <w:t>Cet exercice m’a permis de prendre une distance salutaire face à ma pratique. Mes forces — la communication, la rigueur et l’innovation — constituent un véritable tremplin, mais elles ne deviendront porteuses que si je comble mes lacunes en gestion budgétaire, en cadre juridique et en leadership pédagogique. La formation continue n’est donc pas, pour moi, une obligation administrative : c’est le chemin même par lequel je transformerai un projet ambitieux en une école bien réelle. En nommant clairement où je me situe et où je veux aller, j’ai, je crois, fait un pas dans la bonne direction.</w:t>
+        <w:t>Cet exercice m’a offert une distance salutaire face à ma propre pratique. Mes forces, soit la communication, la rigueur et l’innovation, constituent un véritable tremplin, mais elles ne deviendront pleinement porteuses que si je parviens à combler mes lacunes en gestion budgétaire, en cadre juridique et en leadership pédagogique. La formation continue ne représente donc pas, à mes yeux, une simple obligation administrative, car elle constitue le chemin même par lequel je transformerai un projet ambitieux en une école bien réelle. En nommant avec honnêteté l’endroit où je me situe et celui où je veux aller, j’ai la conviction d’avoir fait un pas déterminant dans la bonne direction.</w:t>
       </w:r>
     </w:p>
     <w:sectPr>
@@ -979,11 +623,11 @@
     <w:qFormat/>
     <w:rsid w:val="00FC693F"/>
     <w:pPr>
-      <w:spacing w:after="160" w:line="276" w:lineRule="auto"/>
+      <w:spacing w:after="200" w:line="360" w:lineRule="auto"/>
     </w:pPr>
     <w:rPr>
       <w:rFonts w:ascii="Calibri" w:hAnsi="Calibri"/>
-      <w:sz w:val="22"/>
+      <w:sz w:val="24"/>
     </w:rPr>
   </w:style>
   <w:style w:type="paragraph" w:styleId="Header">

</xml_diff>

<commit_message>
Ground "Plan de formation continue" in author's real profile
Integrate biography and self-assessment from TP1 (FPE7008, UQAM):
non-profit/garderie director, ~16 years in education, goal of founding
a private school. Add UQAM title page matching course format; keep
continuous prose, no semicolons, smooth transitions.

Co-Authored-By: Claude Opus 4.8 <noreply@anthropic.com>
Claude-Session: https://claude.ai/code/session_014y2uekwXSXYRSbjU1e8mB9
</commit_message>
<xml_diff>
--- a/Plan_de_formation_continue.docx
+++ b/Plan_de_formation_continue.docx
@@ -4,30 +4,133 @@
   <w:body>
     <w:p>
       <w:pPr>
-        <w:spacing w:before="0" w:after="40"/>
+        <w:spacing w:before="480" w:after="1200" w:line="360" w:lineRule="auto"/>
         <w:jc w:val="center"/>
       </w:pPr>
       <w:r>
         <w:rPr>
+          <w:rFonts w:ascii="Times New Roman" w:hAnsi="Times New Roman"/>
           <w:b/>
-          <w:color w:val="1F3A5F"/>
-          <w:sz w:val="36"/>
+          <w:sz w:val="28"/>
+        </w:rPr>
+        <w:t>UNIVERSITÉ DU QUÉBEC À MONTRÉAL</w:t>
+      </w:r>
+    </w:p>
+    <w:p>
+      <w:pPr>
+        <w:spacing w:before="0" w:after="1440" w:line="360" w:lineRule="auto"/>
+        <w:jc w:val="center"/>
+      </w:pPr>
+      <w:r>
+        <w:rPr>
+          <w:rFonts w:ascii="Times New Roman" w:hAnsi="Times New Roman"/>
+          <w:b/>
+          <w:sz w:val="32"/>
         </w:rPr>
         <w:t>VOTRE PLAN DE FORMATION CONTINUE</w:t>
       </w:r>
     </w:p>
     <w:p>
       <w:pPr>
-        <w:spacing w:after="320"/>
+        <w:spacing w:before="0" w:after="40" w:line="360" w:lineRule="auto"/>
         <w:jc w:val="center"/>
       </w:pPr>
       <w:r>
         <w:rPr>
-          <w:i/>
-          <w:color w:val="555555"/>
+          <w:rFonts w:ascii="Times New Roman" w:hAnsi="Times New Roman"/>
+          <w:b w:val="0"/>
           <w:sz w:val="24"/>
         </w:rPr>
-        <w:t>Travail individuel — DESS en gestion de l’éducation</w:t>
+        <w:t>TRAVAIL PRÉSENTÉ À</w:t>
+      </w:r>
+    </w:p>
+    <w:p>
+      <w:pPr>
+        <w:spacing w:before="0" w:after="960" w:line="360" w:lineRule="auto"/>
+        <w:jc w:val="center"/>
+      </w:pPr>
+      <w:r>
+        <w:rPr>
+          <w:rFonts w:ascii="Times New Roman" w:hAnsi="Times New Roman"/>
+          <w:b w:val="0"/>
+          <w:sz w:val="24"/>
+        </w:rPr>
+        <w:t>MONSIEUR MARCEL LECOURS</w:t>
+      </w:r>
+    </w:p>
+    <w:p>
+      <w:pPr>
+        <w:spacing w:before="0" w:after="40" w:line="360" w:lineRule="auto"/>
+        <w:jc w:val="center"/>
+      </w:pPr>
+      <w:r>
+        <w:rPr>
+          <w:rFonts w:ascii="Times New Roman" w:hAnsi="Times New Roman"/>
+          <w:b w:val="0"/>
+          <w:sz w:val="24"/>
+        </w:rPr>
+        <w:t>DANS LE CADRE DU COURS FPE7008</w:t>
+      </w:r>
+    </w:p>
+    <w:p>
+      <w:pPr>
+        <w:spacing w:before="0" w:after="960" w:line="360" w:lineRule="auto"/>
+        <w:jc w:val="center"/>
+      </w:pPr>
+      <w:r>
+        <w:rPr>
+          <w:rFonts w:ascii="Times New Roman" w:hAnsi="Times New Roman"/>
+          <w:b w:val="0"/>
+          <w:sz w:val="24"/>
+        </w:rPr>
+        <w:t>ACTIVITÉ DE SYNTHÈSE ET D’INTÉGRATION À LA FORMATION DE GESTIONNAIRE EN ÉDUCATION</w:t>
+      </w:r>
+    </w:p>
+    <w:p>
+      <w:pPr>
+        <w:spacing w:before="0" w:after="40" w:line="360" w:lineRule="auto"/>
+        <w:jc w:val="center"/>
+      </w:pPr>
+      <w:r>
+        <w:rPr>
+          <w:rFonts w:ascii="Times New Roman" w:hAnsi="Times New Roman"/>
+          <w:b w:val="0"/>
+          <w:sz w:val="24"/>
+        </w:rPr>
+        <w:t>PAR</w:t>
+      </w:r>
+    </w:p>
+    <w:p>
+      <w:pPr>
+        <w:spacing w:before="0" w:after="1440" w:line="360" w:lineRule="auto"/>
+        <w:jc w:val="center"/>
+      </w:pPr>
+      <w:r>
+        <w:rPr>
+          <w:rFonts w:ascii="Times New Roman" w:hAnsi="Times New Roman"/>
+          <w:b/>
+          <w:sz w:val="24"/>
+        </w:rPr>
+        <w:t>MIRZA-ZAIN BAIG</w:t>
+      </w:r>
+    </w:p>
+    <w:p>
+      <w:pPr>
+        <w:spacing w:before="0" w:after="0" w:line="360" w:lineRule="auto"/>
+        <w:jc w:val="center"/>
+      </w:pPr>
+      <w:r>
+        <w:rPr>
+          <w:rFonts w:ascii="Times New Roman" w:hAnsi="Times New Roman"/>
+          <w:b w:val="0"/>
+          <w:sz w:val="24"/>
+        </w:rPr>
+        <w:t>JUIN 2026</w:t>
+      </w:r>
+    </w:p>
+    <w:p>
+      <w:r>
+        <w:br w:type="page"/>
       </w:r>
     </w:p>
     <w:p>
@@ -45,18 +148,20 @@
     </w:p>
     <w:p>
       <w:pPr>
+        <w:ind w:firstLine="480"/>
         <w:jc w:val="both"/>
       </w:pPr>
       <w:r>
-        <w:t>Reconnaître ses forces relève souvent de l’aisance, mais nommer honnêtement ses faiblesses demeure l’un des exercices les plus exigeants du métier de gestionnaire en éducation. Au Québec, la formation continue ne constitue pas un simple ornement professionnel, car elle est consignée au dossier de chaque employé et témoigne de notre volonté de demeurer compétents dans un milieu en constante transformation. C’est précisément dans cet esprit que j’ai pris le temps, tout au long de la session, d’observer ma pratique avec lucidité et de mesurer l’écart qui me sépare encore du gestionnaire que je souhaite devenir. Loin d’être un bilan complaisant, cette démarche se veut une analyse franche de mon cheminement.</w:t>
+        <w:t>Reconnaître ses forces relève souvent de l’aisance, mais nommer honnêtement ses faiblesses demeure l’un des exercices les plus exigeants du métier de gestionnaire en éducation. Au Québec, la formation continue ne constitue pas un simple ornement professionnel, car elle est consignée au dossier de chaque employé et témoigne de notre volonté de demeurer compétents dans un milieu en constante transformation. C’est précisément dans cet esprit que j’ai pris le temps, tout au long de la session, d’observer ma pratique avec lucidité et de mesurer l’écart qui me sépare encore du gestionnaire que je souhaite devenir. Loin d’être un bilan complaisant, cette démarche se veut une analyse franche de mon cheminement, dans la continuité de la pensée réflexive que ce cours synthèse cherche à développer.</w:t>
       </w:r>
     </w:p>
     <w:p>
       <w:pPr>
+        <w:ind w:firstLine="480"/>
         <w:jc w:val="both"/>
       </w:pPr>
       <w:r>
-        <w:t>Ma situation présente par ailleurs une particularité qui rend l’exercice d’autant plus mobilisateur. Je travaille actuellement au sein d’un centre de soutien à l’enseignement à la maison, où j’accompagne quotidiennement des familles et des élèves dans leur parcours d’apprentissage. Mon projet professionnel dépasse toutefois ce cadre, puisque je souhaite fonder mon propre établissement d’enseignement privé et en assumer la direction. Or, ce passage du rôle d’accompagnateur à celui de fondateur et de directeur transforme en profondeur la nature des compétences que je dois maîtriser. Le présent plan de formation continue se présente donc à la fois comme un bilan honnête de mes acquis et comme une feuille de route vers ce projet qui m’anime.</w:t>
+        <w:t>Mon parcours éclaire d’emblée cette réflexion. Je suis impliqué dans le domaine de l’éducation depuis 2010, d’abord comme tuteur dès l’âge de dix-huit ans, puis comme étudiant au baccalauréat en éducation que j’ai complété en 2023. Aujourd’hui, mon travail dépasse largement l’enseignement en classe, puisque je dirige un organisme éducatif à but non lucratif qui offre du tutorat et de l’accompagnement à des enfants en enseignement à la maison, en plus d’être impliqué dans la gestion d’une garderie. Ces fonctions me placent déjà dans un rôle de direction, de supervision d’équipes et de communication avec les familles. Mon ambition, toutefois, va plus loin, car je souhaite fonder ma propre école privée et en assumer la direction générale. Le présent plan de formation continue se présente donc à la fois comme un bilan honnête de mes acquis et comme une feuille de route vers ce projet qui m’anime.</w:t>
       </w:r>
     </w:p>
     <w:p>
@@ -74,14 +179,16 @@
     </w:p>
     <w:p>
       <w:pPr>
+        <w:ind w:firstLine="480"/>
         <w:jc w:val="both"/>
       </w:pPr>
       <w:r>
-        <w:t>L’enseignement à la maison connaît au Québec une croissance marquée, encadré par la Direction de l’enseignement à la maison du ministère de l’Éducation ainsi que par le projet d’apprentissage que chaque famille doit déposer. Mon travail au centre de soutien m’a permis de saisir les besoins réels de ces familles, qu’il s’agisse de structure, de ressources pédagogiques de qualité, de suivi rigoureux ou d’un environnement d’apprentissage véritablement stimulant. Cette proximité avec les familles constitue le terreau de ma réflexion, car elle m’a révélé tout ce qu’un établissement bien pensé pourrait leur offrir.</w:t>
+        <w:t>L’enseignement à la maison connaît au Québec une croissance marquée, encadré par la Direction de l’enseignement à la maison du ministère de l’Éducation ainsi que par le projet d’apprentissage que chaque famille doit déposer. En dirigeant un organisme qui accompagne ces familles, j’ai appris à saisir leurs besoins réels, qu’il s’agisse de structure, de ressources pédagogiques de qualité, de suivi rigoureux ou d’un environnement d’apprentissage véritablement stimulant. Ma participation à la gestion d’une garderie complète cette expérience, car elle m’a familiarisé avec le milieu de la petite enfance, la gestion du personnel éducatif et les responsabilités administratives d’un service éducatif. Cette double réalité constitue le terreau de ma réflexion, parce qu’elle m’a révélé tout ce qu’un établissement bien pensé pourrait offrir aux familles.</w:t>
       </w:r>
     </w:p>
     <w:p>
       <w:pPr>
+        <w:ind w:firstLine="480"/>
         <w:jc w:val="both"/>
       </w:pPr>
       <w:r>
@@ -103,22 +210,25 @@
     </w:p>
     <w:p>
       <w:pPr>
+        <w:ind w:firstLine="480"/>
         <w:jc w:val="both"/>
       </w:pPr>
       <w:r>
-        <w:t>Ma première force réside dans la communication et les relations interpersonnelles, car mon rôle actuel repose entièrement sur la qualité du lien que je tisse avec les familles. Je sais écouter avec attention, reformuler un besoin, désamorcer une inquiétude et bâtir patiemment un climat de confiance. Cette aptitude se révélera déterminante le jour où je devrai mobiliser une équipe enseignante, rassurer des parents et incarner le leadership rassembleur qu’attend toute direction d’école.</w:t>
+        <w:t>Ma première force réside dans la communication et les relations interpersonnelles, car mon travail repose depuis des années sur la qualité du lien que je tisse avec les familles, les élèves et les membres de mes équipes. Je sais écouter avec attention, reformuler un besoin, désamorcer une inquiétude et bâtir patiemment un climat de confiance. Cette aptitude se révélera déterminante le jour où je devrai mobiliser une équipe enseignante autour d’une vision commune, rassurer des parents et incarner le leadership rassembleur qu’attend toute direction d’école.</w:t>
       </w:r>
     </w:p>
     <w:p>
       <w:pPr>
+        <w:ind w:firstLine="480"/>
         <w:jc w:val="both"/>
       </w:pPr>
       <w:r>
-        <w:t>À cette force s’ajoute une organisation rigoureuse, puisque la planification, le suivi méthodique des dossiers et le souci du travail bien fait façonnent ma manière d’agir au quotidien. Dans un projet aussi complexe que la création d’un établissement, où les échéances ministérielles, pédagogiques et administratives s’entrecroisent constamment, cette rigueur devient un atout précieux pour ne rien laisser au hasard. Elle me permet d’aborder l’ampleur de la tâche avec méthode plutôt qu’avec appréhension.</w:t>
+        <w:t>À cette force s’ajoute une organisation rigoureuse, puisque la planification, le suivi méthodique des dossiers et le souci du travail bien fait façonnent ma manière d’agir au quotidien. La gestion simultanée d’un organisme et d’une garderie m’a d’ailleurs obligé à structurer mon temps et à coordonner plusieurs responsabilités à la fois. Dans un projet aussi complexe que la création d’un établissement, où les échéances ministérielles, pédagogiques et administratives s’entrecroisent constamment, cette rigueur devient un atout précieux pour ne rien laisser au hasard. Elle me permet d’aborder l’ampleur de la tâche avec méthode plutôt qu’avec appréhension.</w:t>
       </w:r>
     </w:p>
     <w:p>
       <w:pPr>
+        <w:ind w:firstLine="480"/>
         <w:jc w:val="both"/>
       </w:pPr>
       <w:r>
@@ -140,26 +250,29 @@
     </w:p>
     <w:p>
       <w:pPr>
+        <w:ind w:firstLine="480"/>
         <w:jc w:val="both"/>
       </w:pPr>
       <w:r>
-        <w:t>L’honnêteté de cet exercice m’impose de reconnaître trois zones où mes compétences demeurent nettement insuffisantes au regard de mon projet. La première, et sans doute la plus criante, concerne la gestion budgétaire et des ressources. Je n’ai en effet jamais eu à élaborer un budget de fonctionnement, à projeter des revenus et des dépenses, à gérer une masse salariale ou à assurer la viabilité financière d’une organisation. Pourtant, une école privée demeure aussi une entreprise, et sans équilibre budgétaire, le projet pédagogique le plus inspirant finit inévitablement par s’effondrer.</w:t>
+        <w:t>L’honnêteté de cet exercice m’impose de reconnaître trois zones où mes compétences demeurent insuffisantes au regard de mon projet. La première, et sans doute la plus criante, concerne la gestion budgétaire et des ressources. Bien que je dirige déjà un organisme, je n’ai jamais eu à élaborer le budget de fonctionnement d’une véritable école, à projeter des revenus et des dépenses d’une telle ampleur ni à assurer la viabilité financière d’un établissement qui dépend des inscriptions et des frais de scolarité. Or, une école privée demeure aussi une entreprise soumise à une réelle pression financière, et sans équilibre budgétaire, le projet pédagogique le plus inspirant finit inévitablement par s’effondrer. À cette dimension s’ajoutent le recrutement et la rétention du personnel, qui constituent des défis bien concrets du secteur privé.</w:t>
       </w:r>
     </w:p>
     <w:p>
       <w:pPr>
+        <w:ind w:firstLine="480"/>
         <w:jc w:val="both"/>
       </w:pPr>
       <w:r>
-        <w:t>Ma deuxième faiblesse touche le cadre juridique et la gouvernance, car le secteur de l’éducation se trouve fortement réglementé. La Loi sur l’enseignement privé, les obligations envers le Ministère, le droit du travail, la protection des renseignements personnels encadrée par la Loi 25 et les règles de gouvernance d’un organisme me sont encore peu familiers. Diriger un établissement sans maîtriser ce cadre reviendrait à l’exposer à des risques sérieux, ce que je ne saurais me permettre.</w:t>
+        <w:t>Ma deuxième faiblesse touche le cadre juridique et la gouvernance, car le secteur de l’éducation se trouve fortement réglementé. La Loi sur l’enseignement privé, les obligations envers le Ministère, le droit du travail, la protection des renseignements personnels encadrée par la Loi 25 et les règles de gouvernance d’un organisme me sont encore peu familiers. Je suis d’ailleurs conscient que la discipline du personnel représente l’un des aspects où je me sens le moins à l’aise, parce qu’elle exige du jugement, une documentation rigoureuse, le respect de la progression des mesures et une bonne connaissance des droits des employés. Diriger un établissement sans maîtriser ce cadre reviendrait à l’exposer à des risques sérieux, ce que je ne saurais me permettre.</w:t>
       </w:r>
     </w:p>
     <w:p>
       <w:pPr>
+        <w:ind w:firstLine="480"/>
         <w:jc w:val="both"/>
       </w:pPr>
       <w:r>
-        <w:t>Ma troisième lacune relève du leadership pédagogique, dont les exigences diffèrent profondément de mon expérience actuelle. Accompagner des familles de manière individuelle n’a en effet rien de comparable au fait de diriger une équipe d’enseignants, de superviser l’enseignement, d’analyser des résultats ou de soutenir les élèves à besoins particuliers. Pour cette raison, je dois développer une véritable vision pédagogique d’établissement ainsi que les compétences nécessaires pour la déployer auprès d’un personnel.</w:t>
+        <w:t>Ma troisième lacune relève du leadership pédagogique, dont les exigences diffèrent profondément de mon expérience actuelle. Accompagner des familles ou des élèves de manière individuelle n’a en effet rien de comparable au fait de superviser l’enseignement d’une équipe, d’analyser en profondeur des pratiques d’enseignement, de soutenir un enseignant dans l’amélioration de ses interventions et d’évaluer l’impact réel d’une approche sur la réussite des élèves. C’est précisément la dimension où je me sais le moins outillé, comme je l’ai déjà reconnu dans mon cheminement. Pour cette raison, je dois développer une véritable vision pédagogique d’établissement ainsi que les compétences nécessaires pour la déployer auprès d’un personnel.</w:t>
       </w:r>
     </w:p>
     <w:p>
@@ -177,6 +290,7 @@
     </w:p>
     <w:p>
       <w:pPr>
+        <w:ind w:firstLine="480"/>
         <w:jc w:val="both"/>
       </w:pPr>
       <w:r>
@@ -185,18 +299,20 @@
     </w:p>
     <w:p>
       <w:pPr>
+        <w:ind w:firstLine="480"/>
         <w:jc w:val="both"/>
       </w:pPr>
       <w:r>
-        <w:t>Sur le plan juridique, je souhaite suivre une formation en droit scolaire et en droit de l’éducation qui couvre la Loi sur l’enseignement privé et la Loi sur l’instruction publique. Une formation portant spécifiquement sur la Loi 25 s’impose également, car la protection des renseignements personnels devient incontournable dès lors qu’une école gère les données d’élèves mineurs. J’aimerais par ailleurs suivre une formation en gouvernance, offerte par exemple par le Collège des administrateurs de sociétés, afin de bien comprendre le rôle d’un conseil d’administration et l’étendue de mes responsabilités de dirigeant. Pour ancrer ces apprentissages dans la réalité, je compte rencontrer une direction d’école privée déjà en exercice et consulter attentivement la documentation ministérielle relative à la délivrance des permis.</w:t>
+        <w:t>Sur le plan juridique, je souhaite suivre une formation en droit scolaire et en droit de l’éducation qui couvre la Loi sur l’enseignement privé et la Loi sur l’instruction publique. Une formation portant spécifiquement sur la Loi 25 s’impose également, car la protection des renseignements personnels devient incontournable dès lors qu’une école gère les données d’élèves mineurs. Comme la discipline du personnel demeure pour moi une source d’inconfort, je tiens aussi à me former en gestion des ressources humaines et en supervision du personnel, afin d’apprendre à documenter une situation, à appliquer une progression des mesures et à intervenir avec fermeté tout en respectant les droits des employés. J’aimerais enfin suivre une formation en gouvernance, offerte par exemple par le Collège des administrateurs de sociétés, et rencontrer une direction d’école privée déjà en exercice pour ancrer ces apprentissages dans la réalité du terrain.</w:t>
       </w:r>
     </w:p>
     <w:p>
       <w:pPr>
+        <w:ind w:firstLine="480"/>
         <w:jc w:val="both"/>
       </w:pPr>
       <w:r>
-        <w:t>Pour développer mon leadership pédagogique, la poursuite de mon DESS constitue déjà une assise précieuse, que je souhaite approfondir par des formations de deuxième cycle en supervision pédagogique. Les formations du Centre de transfert pour la réussite éducative du Québec ainsi que divers colloques pédagogiques me permettront de demeurer au fait des pratiques probantes et des approches d’évaluation. Une formation sur l’intervention auprès des élèves à besoins particuliers s’avère tout aussi essentielle, puisque je tiens à bâtir une école réellement inclusive. Enfin, je compte mettre sur pied dès le démarrage une communauté d’apprentissage professionnelle avec ma future équipe, tout en m’appuyant sur ma force technologique pour intégrer judicieusement les outils d’intelligence artificielle au service de la pédagogie.</w:t>
+        <w:t>Pour développer mon leadership pédagogique, la poursuite de mon DESS constitue déjà une assise précieuse, que je souhaite approfondir par des formations de deuxième cycle en supervision pédagogique et en accompagnement du personnel enseignant. Les formations du Centre de transfert pour la réussite éducative du Québec ainsi que divers colloques pédagogiques me permettront de demeurer au fait des pratiques probantes et des approches d’évaluation. Une formation sur l’intervention auprès des élèves à besoins particuliers s’avère tout aussi essentielle, puisque je tiens à bâtir une école réellement inclusive. Enfin, je compte mettre sur pied dès le démarrage une communauté d’apprentissage professionnelle avec ma future équipe, tout en m’appuyant sur ma force technologique pour intégrer judicieusement les outils d’intelligence artificielle au service de la pédagogie.</w:t>
       </w:r>
     </w:p>
     <w:p>
@@ -214,18 +330,20 @@
     </w:p>
     <w:p>
       <w:pPr>
+        <w:ind w:firstLine="480"/>
         <w:jc w:val="both"/>
       </w:pPr>
       <w:r>
-        <w:t>Ma vision se dessine avec clarté, puisque je souhaite ouvrir, dans un horizon de trois ans, un établissement d’enseignement privé à dimension humaine. Cette école s’ancrera dans l’expérience que j’ai développée auprès des familles en enseignement à la maison, tout en étant portée par une gestion rigoureuse et une pédagogie innovante. Pour transformer cette ambition en réalité, je me suis fixé un échéancier progressif qui répartit mes apprentissages sur trois années.</w:t>
+        <w:t>Ma vision se dessine avec clarté, puisque je souhaite ouvrir, dans un horizon de trois ans, une école privée à dimension humaine, au primaire puis au secondaire. Cette école s’ancrera dans l’expérience que j’ai développée auprès des familles en enseignement à la maison, tout en étant portée par une gestion rigoureuse et une pédagogie innovante. Comme la direction générale correspond à mon profil et à mes aspirations, je me prépare à en assumer pleinement la vision, la gouvernance et la responsabilité finale. Pour transformer cette ambition en réalité, je me suis fixé un échéancier progressif qui répartit mes apprentissages sur trois années.</w:t>
       </w:r>
     </w:p>
     <w:p>
       <w:pPr>
+        <w:ind w:firstLine="480"/>
         <w:jc w:val="both"/>
       </w:pPr>
       <w:r>
-        <w:t>La première année sera consacrée à consolider les fondations. Je prévois alors terminer mon DESS, suivre la formation en gestion financière et amorcer mes apprentissages en droit scolaire, tout en rédigeant un premier plan d’affaires accompagné d’un budget prévisionnel. La deuxième année me permettra de préparer concrètement le projet, notamment en complétant mes formations en gouvernance et sur la Loi 25, en déposant ma demande de permis auprès du Ministère et en construisant le projet éducatif de l’école. La troisième année marquera enfin le lancement, alors que je recruterai et accompagnerai une première équipe enseignante, que je déploierai ma vision pédagogique et que j’assumerai pleinement mon rôle de fondateur et de directeur, sans jamais cesser de me former.</w:t>
+        <w:t>La première année sera consacrée à consolider les fondations. Je prévois alors terminer mon DESS, suivre la formation en gestion financière et amorcer mes apprentissages en droit scolaire, tout en rédigeant un premier plan d’affaires accompagné d’un budget prévisionnel. La deuxième année me permettra de préparer concrètement le projet, notamment en complétant mes formations en gouvernance, en ressources humaines et sur la Loi 25, en déposant ma demande de permis auprès du Ministère et en construisant le projet éducatif de l’école. La troisième année marquera enfin le lancement, alors que je recruterai et accompagnerai une première équipe enseignante, que je déploierai ma vision pédagogique et que j’assumerai pleinement mon rôle de fondateur et de directeur. À plus long terme, je souhaite poursuivre mes études à la maîtrise et possiblement au doctorat, dans la perspective d’enseigner un jour à l’université et de contribuer à la formation des futurs gestionnaires en éducation.</w:t>
       </w:r>
     </w:p>
     <w:p>
@@ -243,6 +361,7 @@
     </w:p>
     <w:p>
       <w:pPr>
+        <w:ind w:firstLine="480"/>
         <w:jc w:val="both"/>
       </w:pPr>
       <w:r>
@@ -626,7 +745,7 @@
       <w:spacing w:after="200" w:line="360" w:lineRule="auto"/>
     </w:pPr>
     <w:rPr>
-      <w:rFonts w:ascii="Calibri" w:hAnsi="Calibri"/>
+      <w:rFonts w:ascii="Times New Roman" w:hAnsi="Times New Roman"/>
       <w:sz w:val="24"/>
     </w:rPr>
   </w:style>

</xml_diff>